<commit_message>
Updated keys and added importance of models
</commit_message>
<xml_diff>
--- a/f4_flutter_navigation_widgets.docx
+++ b/f4_flutter_navigation_widgets.docx
@@ -189,10 +189,21 @@
       <w:proofErr w:type="spellStart"/>
       <w:r>
         <w:rPr>
-          <w:sz w:val="36"/>
-          <w:szCs w:val="36"/>
-        </w:rPr>
-        <w:t>appBar</w:t>
+          <w:b/>
+          <w:bCs/>
+          <w:sz w:val="36"/>
+          <w:szCs w:val="36"/>
+        </w:rPr>
+        <w:t>A</w:t>
+      </w:r>
+      <w:r>
+        <w:rPr>
+          <w:b/>
+          <w:bCs/>
+          <w:sz w:val="36"/>
+          <w:szCs w:val="36"/>
+        </w:rPr>
+        <w:t>ppBar</w:t>
       </w:r>
       <w:proofErr w:type="spellEnd"/>
       <w:r>
@@ -2055,6 +2066,7 @@
         <w:t xml:space="preserve">or use </w:t>
       </w:r>
       <w:proofErr w:type="spellStart"/>
+      <w:proofErr w:type="gramStart"/>
       <w:r>
         <w:rPr>
           <w:b/>
@@ -2067,6 +2079,25 @@
       <w:proofErr w:type="spellEnd"/>
       <w:r>
         <w:rPr>
+          <w:b/>
+          <w:bCs/>
+          <w:sz w:val="36"/>
+          <w:szCs w:val="36"/>
+        </w:rPr>
+        <w:t>(</w:t>
+      </w:r>
+      <w:proofErr w:type="gramEnd"/>
+      <w:r>
+        <w:rPr>
+          <w:b/>
+          <w:bCs/>
+          <w:sz w:val="36"/>
+          <w:szCs w:val="36"/>
+        </w:rPr>
+        <w:t>)</w:t>
+      </w:r>
+      <w:r>
+        <w:rPr>
           <w:sz w:val="36"/>
           <w:szCs w:val="36"/>
         </w:rPr>
@@ -2229,7 +2260,16 @@
           <w:sz w:val="36"/>
           <w:szCs w:val="36"/>
         </w:rPr>
-        <w:t>automaticallyImplyLeading</w:t>
+        <w:t>automaticallyImply</w:t>
+      </w:r>
+      <w:r>
+        <w:rPr>
+          <w:b/>
+          <w:bCs/>
+          <w:sz w:val="36"/>
+          <w:szCs w:val="36"/>
+        </w:rPr>
+        <w:t>Actions</w:t>
       </w:r>
       <w:proofErr w:type="spellEnd"/>
       <w:r>

</xml_diff>